<commit_message>
docs: update Word and Markdown documentation with notification center, profile & session management, and executive dashboard
</commit_message>
<xml_diff>
--- a/NexusCRM_Enterprise_Platform_Documentation.docx
+++ b/NexusCRM_Enterprise_Platform_Documentation.docx
@@ -237,7 +237,7 @@
                 <w:sz w:val="19"/>
                 <w:szCs w:val="19"/>
               </w:rPr>
-              <w:t xml:space="preserve">v1.0.0 (Production Release — All 10 Phases Operational)</w:t>
+              <w:t xml:space="preserve">v1.2.0 (Enterprise Release — In-App Notifications &amp; Session Governance)</w:t>
             </w:r>
           </w:p>
         </w:tc>
@@ -493,7 +493,7 @@
                 <w:sz w:val="19"/>
                 <w:szCs w:val="19"/>
               </w:rPr>
-              <w:t xml:space="preserve">87/87 Unit &amp; Integration Test Suites Passing (100% Pass Rate)</w:t>
+              <w:t xml:space="preserve">97/97 Unit &amp; Integration Tests Passing across 12 Test Suites (100% Pass Rate)</w:t>
             </w:r>
           </w:p>
         </w:tc>
@@ -809,6 +809,96 @@
           <w:szCs w:val="21"/>
         </w:rPr>
         <w:t xml:space="preserve"> Full audit trail logging of all user activities, status changes, and data modifications for compliance.</w:t>
+      </w:r>
+    </w:p>
+    <w:p>
+      <w:pPr>
+        <w:pStyle w:val="ListParagraph"/>
+        <w:numPr>
+          <w:ilvl w:val="0"/>
+          <w:numId w:val="1"/>
+        </w:numPr>
+        <w:spacing w:after="60" w:before="60" w:line="260"/>
+      </w:pPr>
+      <w:r>
+        <w:rPr>
+          <w:rFonts w:ascii="Calibri" w:cs="Calibri" w:eastAsia="Calibri" w:hAnsi="Calibri"/>
+          <w:b/>
+          <w:bCs/>
+          <w:color w:val="0F172A"/>
+          <w:sz w:val="21"/>
+          <w:szCs w:val="21"/>
+        </w:rPr>
+        <w:t xml:space="preserve">In-App Notification Center:</w:t>
+      </w:r>
+      <w:r>
+        <w:rPr>
+          <w:rFonts w:ascii="Calibri" w:cs="Calibri" w:eastAsia="Calibri" w:hAnsi="Calibri"/>
+          <w:color w:val="334155"/>
+          <w:sz w:val="21"/>
+          <w:szCs w:val="21"/>
+        </w:rPr>
+        <w:t xml:space="preserve"> Dynamic notification center alerting agents to won deals, quote approvals, and assigned leads with unread count badges.</w:t>
+      </w:r>
+    </w:p>
+    <w:p>
+      <w:pPr>
+        <w:pStyle w:val="ListParagraph"/>
+        <w:numPr>
+          <w:ilvl w:val="0"/>
+          <w:numId w:val="1"/>
+        </w:numPr>
+        <w:spacing w:after="60" w:before="60" w:line="260"/>
+      </w:pPr>
+      <w:r>
+        <w:rPr>
+          <w:rFonts w:ascii="Calibri" w:cs="Calibri" w:eastAsia="Calibri" w:hAnsi="Calibri"/>
+          <w:b/>
+          <w:bCs/>
+          <w:color w:val="0F172A"/>
+          <w:sz w:val="21"/>
+          <w:szCs w:val="21"/>
+        </w:rPr>
+        <w:t xml:space="preserve">Account &amp; Session Governance:</w:t>
+      </w:r>
+      <w:r>
+        <w:rPr>
+          <w:rFonts w:ascii="Calibri" w:cs="Calibri" w:eastAsia="Calibri" w:hAnsi="Calibri"/>
+          <w:color w:val="334155"/>
+          <w:sz w:val="21"/>
+          <w:szCs w:val="21"/>
+        </w:rPr>
+        <w:t xml:space="preserve"> Granular profile management, password security checks, and active device session tracking with remote revocation.</w:t>
+      </w:r>
+    </w:p>
+    <w:p>
+      <w:pPr>
+        <w:pStyle w:val="ListParagraph"/>
+        <w:numPr>
+          <w:ilvl w:val="0"/>
+          <w:numId w:val="1"/>
+        </w:numPr>
+        <w:spacing w:after="60" w:before="60" w:line="260"/>
+      </w:pPr>
+      <w:r>
+        <w:rPr>
+          <w:rFonts w:ascii="Calibri" w:cs="Calibri" w:eastAsia="Calibri" w:hAnsi="Calibri"/>
+          <w:b/>
+          <w:bCs/>
+          <w:color w:val="0F172A"/>
+          <w:sz w:val="21"/>
+          <w:szCs w:val="21"/>
+        </w:rPr>
+        <w:t xml:space="preserve">Executive Command Dashboard:</w:t>
+      </w:r>
+      <w:r>
+        <w:rPr>
+          <w:rFonts w:ascii="Calibri" w:cs="Calibri" w:eastAsia="Calibri" w:hAnsi="Calibri"/>
+          <w:color w:val="334155"/>
+          <w:sz w:val="21"/>
+          <w:szCs w:val="21"/>
+        </w:rPr>
+        <w:t xml:space="preserve"> High-level KPI widgets, visual stage-by-stage conversion funnels, prioritized deals, hot leads, and action queues.</w:t>
       </w:r>
     </w:p>
     <w:p>
@@ -2759,7 +2849,7 @@
           <w:sz w:val="26"/>
           <w:szCs w:val="26"/>
         </w:rPr>
-        <w:t xml:space="preserve">Module 8: Sales Analytics, Funnels &amp; Forecasting</w:t>
+        <w:t xml:space="preserve">Module 8: Sales Analytics, Funnels &amp; Executive Dashboard</w:t>
       </w:r>
     </w:p>
     <w:p>
@@ -2773,7 +2863,7 @@
           <w:sz w:val="22"/>
           <w:szCs w:val="22"/>
         </w:rPr>
-        <w:t xml:space="preserve">The reporting suite processes high-volume aggregations via MongoDB Pipelines to produce real-time executive dashboards:</w:t>
+        <w:t xml:space="preserve">The reporting suite processes high-volume aggregations via MongoDB Pipelines to produce real-time executive intelligence and interactive dashboards:</w:t>
       </w:r>
     </w:p>
     <w:p>
@@ -2794,7 +2884,7 @@
           <w:sz w:val="21"/>
           <w:szCs w:val="21"/>
         </w:rPr>
-        <w:t xml:space="preserve">Full Conversion Funnel:</w:t>
+        <w:t xml:space="preserve">Executive KPI Metrics:</w:t>
       </w:r>
       <w:r>
         <w:rPr>
@@ -2803,7 +2893,7 @@
           <w:sz w:val="21"/>
           <w:szCs w:val="21"/>
         </w:rPr>
-        <w:t xml:space="preserve"> Tracks conversion percentages and stage drop-offs from raw lead ingestion to Closed Won.</w:t>
+        <w:t xml:space="preserve"> Top-level KPI cards reporting Total Open Pipeline Value, Closed Won Revenue, Active Lead count, and Deal Win Rate with historical trend markers.</w:t>
       </w:r>
     </w:p>
     <w:p>
@@ -2824,7 +2914,7 @@
           <w:sz w:val="21"/>
           <w:szCs w:val="21"/>
         </w:rPr>
-        <w:t xml:space="preserve">Weighted Revenue Forecast:</w:t>
+        <w:t xml:space="preserve">Visual Conversion Funnel:</w:t>
       </w:r>
       <w:r>
         <w:rPr>
@@ -2833,7 +2923,7 @@
           <w:sz w:val="21"/>
           <w:szCs w:val="21"/>
         </w:rPr>
-        <w:t xml:space="preserve"> Monthly and quarterly revenue projections categorized into Commit, Best Case, and Pipeline cohorts.</w:t>
+        <w:t xml:space="preserve"> Tracks conversion percentages and stage drop-offs from raw lead ingestion to Closed Won.</w:t>
       </w:r>
     </w:p>
     <w:p>
@@ -2854,7 +2944,7 @@
           <w:sz w:val="21"/>
           <w:szCs w:val="21"/>
         </w:rPr>
-        <w:t xml:space="preserve">Win/Loss Attribution:</w:t>
+        <w:t xml:space="preserve">Weighted Revenue Forecast:</w:t>
       </w:r>
       <w:r>
         <w:rPr>
@@ -2863,7 +2953,7 @@
           <w:sz w:val="21"/>
           <w:szCs w:val="21"/>
         </w:rPr>
-        <w:t xml:space="preserve"> Analyzes lost reasons, competitor wins, and average sales cycle lengths.</w:t>
+        <w:t xml:space="preserve"> Monthly and quarterly revenue projections categorized into Commit, Best Case, and Pipeline cohorts.</w:t>
       </w:r>
     </w:p>
     <w:p>
@@ -2884,6 +2974,96 @@
           <w:sz w:val="21"/>
           <w:szCs w:val="21"/>
         </w:rPr>
+        <w:t xml:space="preserve">Top Deals Focus:</w:t>
+      </w:r>
+      <w:r>
+        <w:rPr>
+          <w:rFonts w:ascii="Calibri" w:cs="Calibri" w:eastAsia="Calibri" w:hAnsi="Calibri"/>
+          <w:color w:val="334155"/>
+          <w:sz w:val="21"/>
+          <w:szCs w:val="21"/>
+        </w:rPr>
+        <w:t xml:space="preserve"> High-priority open opportunities with expected close dates and immediate status visibility.</w:t>
+      </w:r>
+    </w:p>
+    <w:p>
+      <w:pPr>
+        <w:pStyle w:val="ListParagraph"/>
+        <w:numPr>
+          <w:ilvl w:val="0"/>
+          <w:numId w:val="1"/>
+        </w:numPr>
+        <w:spacing w:after="60" w:before="60" w:line="260"/>
+      </w:pPr>
+      <w:r>
+        <w:rPr>
+          <w:rFonts w:ascii="Calibri" w:cs="Calibri" w:eastAsia="Calibri" w:hAnsi="Calibri"/>
+          <w:b/>
+          <w:bCs/>
+          <w:color w:val="0F172A"/>
+          <w:sz w:val="21"/>
+          <w:szCs w:val="21"/>
+        </w:rPr>
+        <w:t xml:space="preserve">Immediate Action Queue:</w:t>
+      </w:r>
+      <w:r>
+        <w:rPr>
+          <w:rFonts w:ascii="Calibri" w:cs="Calibri" w:eastAsia="Calibri" w:hAnsi="Calibri"/>
+          <w:color w:val="334155"/>
+          <w:sz w:val="21"/>
+          <w:szCs w:val="21"/>
+        </w:rPr>
+        <w:t xml:space="preserve"> Prioritized queue of due and overdue tasks with 1-click completion toggles.</w:t>
+      </w:r>
+    </w:p>
+    <w:p>
+      <w:pPr>
+        <w:pStyle w:val="ListParagraph"/>
+        <w:numPr>
+          <w:ilvl w:val="0"/>
+          <w:numId w:val="1"/>
+        </w:numPr>
+        <w:spacing w:after="60" w:before="60" w:line="260"/>
+      </w:pPr>
+      <w:r>
+        <w:rPr>
+          <w:rFonts w:ascii="Calibri" w:cs="Calibri" w:eastAsia="Calibri" w:hAnsi="Calibri"/>
+          <w:b/>
+          <w:bCs/>
+          <w:color w:val="0F172A"/>
+          <w:sz w:val="21"/>
+          <w:szCs w:val="21"/>
+        </w:rPr>
+        <w:t xml:space="preserve">AI Hot Leads:</w:t>
+      </w:r>
+      <w:r>
+        <w:rPr>
+          <w:rFonts w:ascii="Calibri" w:cs="Calibri" w:eastAsia="Calibri" w:hAnsi="Calibri"/>
+          <w:color w:val="334155"/>
+          <w:sz w:val="21"/>
+          <w:szCs w:val="21"/>
+        </w:rPr>
+        <w:t xml:space="preserve"> Top prospects graded 80-100 with direct call, email, and stage progression actions.</w:t>
+      </w:r>
+    </w:p>
+    <w:p>
+      <w:pPr>
+        <w:pStyle w:val="ListParagraph"/>
+        <w:numPr>
+          <w:ilvl w:val="0"/>
+          <w:numId w:val="1"/>
+        </w:numPr>
+        <w:spacing w:after="60" w:before="60" w:line="260"/>
+      </w:pPr>
+      <w:r>
+        <w:rPr>
+          <w:rFonts w:ascii="Calibri" w:cs="Calibri" w:eastAsia="Calibri" w:hAnsi="Calibri"/>
+          <w:b/>
+          <w:bCs/>
+          <w:color w:val="0F172A"/>
+          <w:sz w:val="21"/>
+          <w:szCs w:val="21"/>
+        </w:rPr>
         <w:t xml:space="preserve">Rep Leaderboard:</w:t>
       </w:r>
       <w:r>
@@ -2956,6 +3136,308 @@
           <w:szCs w:val="22"/>
         </w:rPr>
         <w:t xml:space="preserve">Every sensitive mutation (user creation, password reset, permission escalation, record deletion, bulk export) writes an immutable record to the AuditLog collection, recording Actor ID, IP Address, User Agent, Resource Type, Action, and Before/After snapshots.</w:t>
+      </w:r>
+    </w:p>
+    <w:p>
+      <w:pPr>
+        <w:pStyle w:val="Heading2"/>
+        <w:spacing w:after="120" w:before="280"/>
+      </w:pPr>
+      <w:r>
+        <w:rPr>
+          <w:rFonts w:ascii="Calibri" w:cs="Calibri" w:eastAsia="Calibri" w:hAnsi="Calibri"/>
+          <w:b/>
+          <w:bCs/>
+          <w:color w:val="0F172A"/>
+          <w:sz w:val="26"/>
+          <w:szCs w:val="26"/>
+        </w:rPr>
+        <w:t xml:space="preserve">Module 11: Interactive In-App Notification Center</w:t>
+      </w:r>
+    </w:p>
+    <w:p>
+      <w:pPr>
+        <w:spacing w:after="120" w:before="80" w:line="280"/>
+      </w:pPr>
+      <w:r>
+        <w:rPr>
+          <w:rFonts w:ascii="Calibri" w:cs="Calibri" w:eastAsia="Calibri" w:hAnsi="Calibri"/>
+          <w:color w:val="334155"/>
+          <w:sz w:val="22"/>
+          <w:szCs w:val="22"/>
+        </w:rPr>
+        <w:t xml:space="preserve">NexusCRM incorporates an asynchronous In-App Notification Center providing real-time situational awareness across commercial events and operational workflows:</w:t>
+      </w:r>
+    </w:p>
+    <w:p>
+      <w:pPr>
+        <w:pStyle w:val="ListParagraph"/>
+        <w:numPr>
+          <w:ilvl w:val="0"/>
+          <w:numId w:val="1"/>
+        </w:numPr>
+        <w:spacing w:after="60" w:before="60" w:line="260"/>
+      </w:pPr>
+      <w:r>
+        <w:rPr>
+          <w:rFonts w:ascii="Calibri" w:cs="Calibri" w:eastAsia="Calibri" w:hAnsi="Calibri"/>
+          <w:b/>
+          <w:bCs/>
+          <w:color w:val="0F172A"/>
+          <w:sz w:val="21"/>
+          <w:szCs w:val="21"/>
+        </w:rPr>
+        <w:t xml:space="preserve">Real-Time Notification Bell:</w:t>
+      </w:r>
+      <w:r>
+        <w:rPr>
+          <w:rFonts w:ascii="Calibri" w:cs="Calibri" w:eastAsia="Calibri" w:hAnsi="Calibri"/>
+          <w:color w:val="334155"/>
+          <w:sz w:val="21"/>
+          <w:szCs w:val="21"/>
+        </w:rPr>
+        <w:t xml:space="preserve"> Dynamic bell icon in the top navigation header featuring an unread count badge (with automatic 99+ formatting) and a quick-open dropdown panel.</w:t>
+      </w:r>
+    </w:p>
+    <w:p>
+      <w:pPr>
+        <w:pStyle w:val="ListParagraph"/>
+        <w:numPr>
+          <w:ilvl w:val="0"/>
+          <w:numId w:val="1"/>
+        </w:numPr>
+        <w:spacing w:after="60" w:before="60" w:line="260"/>
+      </w:pPr>
+      <w:r>
+        <w:rPr>
+          <w:rFonts w:ascii="Calibri" w:cs="Calibri" w:eastAsia="Calibri" w:hAnsi="Calibri"/>
+          <w:b/>
+          <w:bCs/>
+          <w:color w:val="0F172A"/>
+          <w:sz w:val="21"/>
+          <w:szCs w:val="21"/>
+        </w:rPr>
+        <w:t xml:space="preserve">Workflow Event Automation:</w:t>
+      </w:r>
+      <w:r>
+        <w:rPr>
+          <w:rFonts w:ascii="Calibri" w:cs="Calibri" w:eastAsia="Calibri" w:hAnsi="Calibri"/>
+          <w:color w:val="334155"/>
+          <w:sz w:val="21"/>
+          <w:szCs w:val="21"/>
+        </w:rPr>
+        <w:t xml:space="preserve"> Automatically triggers in-app alerts when deals are won, leads are assigned, quotation discount requests are approved or rejected, and activity reminders trigger.</w:t>
+      </w:r>
+    </w:p>
+    <w:p>
+      <w:pPr>
+        <w:pStyle w:val="ListParagraph"/>
+        <w:numPr>
+          <w:ilvl w:val="0"/>
+          <w:numId w:val="1"/>
+        </w:numPr>
+        <w:spacing w:after="60" w:before="60" w:line="260"/>
+      </w:pPr>
+      <w:r>
+        <w:rPr>
+          <w:rFonts w:ascii="Calibri" w:cs="Calibri" w:eastAsia="Calibri" w:hAnsi="Calibri"/>
+          <w:b/>
+          <w:bCs/>
+          <w:color w:val="0F172A"/>
+          <w:sz w:val="21"/>
+          <w:szCs w:val="21"/>
+        </w:rPr>
+        <w:t xml:space="preserve">Interactive Drawer Governance:</w:t>
+      </w:r>
+      <w:r>
+        <w:rPr>
+          <w:rFonts w:ascii="Calibri" w:cs="Calibri" w:eastAsia="Calibri" w:hAnsi="Calibri"/>
+          <w:color w:val="334155"/>
+          <w:sz w:val="21"/>
+          <w:szCs w:val="21"/>
+        </w:rPr>
+        <w:t xml:space="preserve"> Users can toggle between "All Notifications" and "Unread" filters, mark individual or all notifications as read, and remove dismissed alerts.</w:t>
+      </w:r>
+    </w:p>
+    <w:p>
+      <w:pPr>
+        <w:pStyle w:val="ListParagraph"/>
+        <w:numPr>
+          <w:ilvl w:val="0"/>
+          <w:numId w:val="1"/>
+        </w:numPr>
+        <w:spacing w:after="60" w:before="60" w:line="260"/>
+      </w:pPr>
+      <w:r>
+        <w:rPr>
+          <w:rFonts w:ascii="Calibri" w:cs="Calibri" w:eastAsia="Calibri" w:hAnsi="Calibri"/>
+          <w:b/>
+          <w:bCs/>
+          <w:color w:val="0F172A"/>
+          <w:sz w:val="21"/>
+          <w:szCs w:val="21"/>
+        </w:rPr>
+        <w:t xml:space="preserve">Lightweight Polling Engine:</w:t>
+      </w:r>
+      <w:r>
+        <w:rPr>
+          <w:rFonts w:ascii="Calibri" w:cs="Calibri" w:eastAsia="Calibri" w:hAnsi="Calibri"/>
+          <w:color w:val="334155"/>
+          <w:sz w:val="21"/>
+          <w:szCs w:val="21"/>
+        </w:rPr>
+        <w:t xml:space="preserve"> Operates via a resilient 30-second interval polling architecture querying indexed MongoDB notification collections with zero WebSocket serverless disconnect overhead.</w:t>
+      </w:r>
+    </w:p>
+    <w:p>
+      <w:pPr>
+        <w:pStyle w:val="Heading2"/>
+        <w:spacing w:after="120" w:before="280"/>
+      </w:pPr>
+      <w:r>
+        <w:rPr>
+          <w:rFonts w:ascii="Calibri" w:cs="Calibri" w:eastAsia="Calibri" w:hAnsi="Calibri"/>
+          <w:b/>
+          <w:bCs/>
+          <w:color w:val="0F172A"/>
+          <w:sz w:val="26"/>
+          <w:szCs w:val="26"/>
+        </w:rPr>
+        <w:t xml:space="preserve">Module 12: Account Profile, Security &amp; Session Governance</w:t>
+      </w:r>
+    </w:p>
+    <w:p>
+      <w:pPr>
+        <w:spacing w:after="120" w:before="80" w:line="280"/>
+      </w:pPr>
+      <w:r>
+        <w:rPr>
+          <w:rFonts w:ascii="Calibri" w:cs="Calibri" w:eastAsia="Calibri" w:hAnsi="Calibri"/>
+          <w:color w:val="334155"/>
+          <w:sz w:val="22"/>
+          <w:szCs w:val="22"/>
+        </w:rPr>
+        <w:t xml:space="preserve">Enterprise security extends to user-level self-service governance, accessible directly via the top-right account dropdown into dedicated settings sub-tabs:</w:t>
+      </w:r>
+    </w:p>
+    <w:p>
+      <w:pPr>
+        <w:pStyle w:val="ListParagraph"/>
+        <w:numPr>
+          <w:ilvl w:val="0"/>
+          <w:numId w:val="1"/>
+        </w:numPr>
+        <w:spacing w:after="60" w:before="60" w:line="260"/>
+      </w:pPr>
+      <w:r>
+        <w:rPr>
+          <w:rFonts w:ascii="Calibri" w:cs="Calibri" w:eastAsia="Calibri" w:hAnsi="Calibri"/>
+          <w:b/>
+          <w:bCs/>
+          <w:color w:val="0F172A"/>
+          <w:sz w:val="21"/>
+          <w:szCs w:val="21"/>
+        </w:rPr>
+        <w:t xml:space="preserve">Profile Customization:</w:t>
+      </w:r>
+      <w:r>
+        <w:rPr>
+          <w:rFonts w:ascii="Calibri" w:cs="Calibri" w:eastAsia="Calibri" w:hAnsi="Calibri"/>
+          <w:color w:val="334155"/>
+          <w:sz w:val="21"/>
+          <w:szCs w:val="21"/>
+        </w:rPr>
+        <w:t xml:space="preserve"> Users can manage their personal identity (first name, last name, phone number, and avatar image URL) while viewing immutable enterprise metadata (email, tenant ID, and assigned RBAC role badge).</w:t>
+      </w:r>
+    </w:p>
+    <w:p>
+      <w:pPr>
+        <w:pStyle w:val="ListParagraph"/>
+        <w:numPr>
+          <w:ilvl w:val="0"/>
+          <w:numId w:val="1"/>
+        </w:numPr>
+        <w:spacing w:after="60" w:before="60" w:line="260"/>
+      </w:pPr>
+      <w:r>
+        <w:rPr>
+          <w:rFonts w:ascii="Calibri" w:cs="Calibri" w:eastAsia="Calibri" w:hAnsi="Calibri"/>
+          <w:b/>
+          <w:bCs/>
+          <w:color w:val="0F172A"/>
+          <w:sz w:val="21"/>
+          <w:szCs w:val="21"/>
+        </w:rPr>
+        <w:t xml:space="preserve">Password Security:</w:t>
+      </w:r>
+      <w:r>
+        <w:rPr>
+          <w:rFonts w:ascii="Calibri" w:cs="Calibri" w:eastAsia="Calibri" w:hAnsi="Calibri"/>
+          <w:color w:val="334155"/>
+          <w:sz w:val="21"/>
+          <w:szCs w:val="21"/>
+        </w:rPr>
+        <w:t xml:space="preserve"> Self-service password rotation requiring current password verification and enforcing strict password complexity rules (minimum 8 characters, uppercase, lowercase, and numbers).</w:t>
+      </w:r>
+    </w:p>
+    <w:p>
+      <w:pPr>
+        <w:pStyle w:val="ListParagraph"/>
+        <w:numPr>
+          <w:ilvl w:val="0"/>
+          <w:numId w:val="1"/>
+        </w:numPr>
+        <w:spacing w:after="60" w:before="60" w:line="260"/>
+      </w:pPr>
+      <w:r>
+        <w:rPr>
+          <w:rFonts w:ascii="Calibri" w:cs="Calibri" w:eastAsia="Calibri" w:hAnsi="Calibri"/>
+          <w:b/>
+          <w:bCs/>
+          <w:color w:val="0F172A"/>
+          <w:sz w:val="21"/>
+          <w:szCs w:val="21"/>
+        </w:rPr>
+        <w:t xml:space="preserve">Active Session Tracking:</w:t>
+      </w:r>
+      <w:r>
+        <w:rPr>
+          <w:rFonts w:ascii="Calibri" w:cs="Calibri" w:eastAsia="Calibri" w:hAnsi="Calibri"/>
+          <w:color w:val="334155"/>
+          <w:sz w:val="21"/>
+          <w:szCs w:val="21"/>
+        </w:rPr>
+        <w:t xml:space="preserve"> Real-time registry of all active device sessions displaying IP address, browser/OS fingerprint (User-Agent parsing), creation timestamp, and last activity date.</w:t>
+      </w:r>
+    </w:p>
+    <w:p>
+      <w:pPr>
+        <w:pStyle w:val="ListParagraph"/>
+        <w:numPr>
+          <w:ilvl w:val="0"/>
+          <w:numId w:val="1"/>
+        </w:numPr>
+        <w:spacing w:after="60" w:before="60" w:line="260"/>
+      </w:pPr>
+      <w:r>
+        <w:rPr>
+          <w:rFonts w:ascii="Calibri" w:cs="Calibri" w:eastAsia="Calibri" w:hAnsi="Calibri"/>
+          <w:b/>
+          <w:bCs/>
+          <w:color w:val="0F172A"/>
+          <w:sz w:val="21"/>
+          <w:szCs w:val="21"/>
+        </w:rPr>
+        <w:t xml:space="preserve">Remote Session Revocation:</w:t>
+      </w:r>
+      <w:r>
+        <w:rPr>
+          <w:rFonts w:ascii="Calibri" w:cs="Calibri" w:eastAsia="Calibri" w:hAnsi="Calibri"/>
+          <w:color w:val="334155"/>
+          <w:sz w:val="21"/>
+          <w:szCs w:val="21"/>
+        </w:rPr>
+        <w:t xml:space="preserve"> Users can remotely revoke specific suspicious device sessions or execute a "Revoke All Other Sessions" command to immediately invalidate refresh tokens across compromised devices.</w:t>
       </w:r>
     </w:p>
     <w:p>
@@ -4897,6 +5379,1266 @@
           </w:p>
         </w:tc>
       </w:tr>
+      <w:tr>
+        <w:tc>
+          <w:tcPr>
+            <w:tcW w:type="pct" w:w="750"/>
+            <w:tcBorders>
+              <w:top w:val="single" w:color="CBD5E1" w:sz="1"/>
+              <w:left w:val="single" w:color="CBD5E1" w:sz="1"/>
+              <w:bottom w:val="single" w:color="CBD5E1" w:sz="1"/>
+              <w:right w:val="single" w:color="CBD5E1" w:sz="1"/>
+            </w:tcBorders>
+            <w:shd w:fill="FFFFFF" w:val="clear"/>
+            <w:tcMar>
+              <w:top w:type="dxa" w:w="120"/>
+              <w:left w:type="dxa" w:w="180"/>
+              <w:bottom w:type="dxa" w:w="120"/>
+              <w:right w:type="dxa" w:w="180"/>
+            </w:tcMar>
+          </w:tcPr>
+          <w:p>
+            <w:r>
+              <w:rPr>
+                <w:rFonts w:ascii="Calibri" w:cs="Calibri" w:eastAsia="Calibri" w:hAnsi="Calibri"/>
+                <w:b/>
+                <w:bCs/>
+                <w:color w:val="334155"/>
+                <w:sz w:val="19"/>
+                <w:szCs w:val="19"/>
+              </w:rPr>
+              <w:t xml:space="preserve">GET</w:t>
+            </w:r>
+          </w:p>
+        </w:tc>
+        <w:tc>
+          <w:tcPr>
+            <w:tcW w:type="pct" w:w="1750"/>
+            <w:tcBorders>
+              <w:top w:val="single" w:color="CBD5E1" w:sz="1"/>
+              <w:left w:val="single" w:color="CBD5E1" w:sz="1"/>
+              <w:bottom w:val="single" w:color="CBD5E1" w:sz="1"/>
+              <w:right w:val="single" w:color="CBD5E1" w:sz="1"/>
+            </w:tcBorders>
+            <w:shd w:fill="FFFFFF" w:val="clear"/>
+            <w:tcMar>
+              <w:top w:type="dxa" w:w="120"/>
+              <w:left w:type="dxa" w:w="180"/>
+              <w:bottom w:type="dxa" w:w="120"/>
+              <w:right w:type="dxa" w:w="180"/>
+            </w:tcMar>
+          </w:tcPr>
+          <w:p>
+            <w:r>
+              <w:rPr>
+                <w:rFonts w:ascii="Calibri" w:cs="Calibri" w:eastAsia="Calibri" w:hAnsi="Calibri"/>
+                <w:b w:val="false"/>
+                <w:bCs w:val="false"/>
+                <w:color w:val="334155"/>
+                <w:sz w:val="19"/>
+                <w:szCs w:val="19"/>
+              </w:rPr>
+              <w:t xml:space="preserve">/api/v1/notifications</w:t>
+            </w:r>
+          </w:p>
+        </w:tc>
+        <w:tc>
+          <w:tcPr>
+            <w:tcW w:type="pct" w:w="1000"/>
+            <w:tcBorders>
+              <w:top w:val="single" w:color="CBD5E1" w:sz="1"/>
+              <w:left w:val="single" w:color="CBD5E1" w:sz="1"/>
+              <w:bottom w:val="single" w:color="CBD5E1" w:sz="1"/>
+              <w:right w:val="single" w:color="CBD5E1" w:sz="1"/>
+            </w:tcBorders>
+            <w:shd w:fill="FFFFFF" w:val="clear"/>
+            <w:tcMar>
+              <w:top w:type="dxa" w:w="120"/>
+              <w:left w:type="dxa" w:w="180"/>
+              <w:bottom w:type="dxa" w:w="120"/>
+              <w:right w:type="dxa" w:w="180"/>
+            </w:tcMar>
+          </w:tcPr>
+          <w:p>
+            <w:r>
+              <w:rPr>
+                <w:rFonts w:ascii="Calibri" w:cs="Calibri" w:eastAsia="Calibri" w:hAnsi="Calibri"/>
+                <w:b w:val="false"/>
+                <w:bCs w:val="false"/>
+                <w:color w:val="334155"/>
+                <w:sz w:val="19"/>
+                <w:szCs w:val="19"/>
+              </w:rPr>
+              <w:t xml:space="preserve">Authenticated</w:t>
+            </w:r>
+          </w:p>
+        </w:tc>
+        <w:tc>
+          <w:tcPr>
+            <w:tcW w:type="pct" w:w="1500"/>
+            <w:tcBorders>
+              <w:top w:val="single" w:color="CBD5E1" w:sz="1"/>
+              <w:left w:val="single" w:color="CBD5E1" w:sz="1"/>
+              <w:bottom w:val="single" w:color="CBD5E1" w:sz="1"/>
+              <w:right w:val="single" w:color="CBD5E1" w:sz="1"/>
+            </w:tcBorders>
+            <w:shd w:fill="FFFFFF" w:val="clear"/>
+            <w:tcMar>
+              <w:top w:type="dxa" w:w="120"/>
+              <w:left w:type="dxa" w:w="180"/>
+              <w:bottom w:type="dxa" w:w="120"/>
+              <w:right w:type="dxa" w:w="180"/>
+            </w:tcMar>
+          </w:tcPr>
+          <w:p>
+            <w:r>
+              <w:rPr>
+                <w:rFonts w:ascii="Calibri" w:cs="Calibri" w:eastAsia="Calibri" w:hAnsi="Calibri"/>
+                <w:b w:val="false"/>
+                <w:bCs w:val="false"/>
+                <w:color w:val="334155"/>
+                <w:sz w:val="19"/>
+                <w:szCs w:val="19"/>
+              </w:rPr>
+              <w:t xml:space="preserve">Paginated notifications with read/unread and type filtering</w:t>
+            </w:r>
+          </w:p>
+        </w:tc>
+      </w:tr>
+      <w:tr>
+        <w:tc>
+          <w:tcPr>
+            <w:tcW w:type="pct" w:w="750"/>
+            <w:tcBorders>
+              <w:top w:val="single" w:color="CBD5E1" w:sz="1"/>
+              <w:left w:val="single" w:color="CBD5E1" w:sz="1"/>
+              <w:bottom w:val="single" w:color="CBD5E1" w:sz="1"/>
+              <w:right w:val="single" w:color="CBD5E1" w:sz="1"/>
+            </w:tcBorders>
+            <w:shd w:fill="F8FAFC" w:val="clear"/>
+            <w:tcMar>
+              <w:top w:type="dxa" w:w="120"/>
+              <w:left w:type="dxa" w:w="180"/>
+              <w:bottom w:type="dxa" w:w="120"/>
+              <w:right w:type="dxa" w:w="180"/>
+            </w:tcMar>
+          </w:tcPr>
+          <w:p>
+            <w:r>
+              <w:rPr>
+                <w:rFonts w:ascii="Calibri" w:cs="Calibri" w:eastAsia="Calibri" w:hAnsi="Calibri"/>
+                <w:b/>
+                <w:bCs/>
+                <w:color w:val="334155"/>
+                <w:sz w:val="19"/>
+                <w:szCs w:val="19"/>
+              </w:rPr>
+              <w:t xml:space="preserve">GET</w:t>
+            </w:r>
+          </w:p>
+        </w:tc>
+        <w:tc>
+          <w:tcPr>
+            <w:tcW w:type="pct" w:w="1750"/>
+            <w:tcBorders>
+              <w:top w:val="single" w:color="CBD5E1" w:sz="1"/>
+              <w:left w:val="single" w:color="CBD5E1" w:sz="1"/>
+              <w:bottom w:val="single" w:color="CBD5E1" w:sz="1"/>
+              <w:right w:val="single" w:color="CBD5E1" w:sz="1"/>
+            </w:tcBorders>
+            <w:shd w:fill="F8FAFC" w:val="clear"/>
+            <w:tcMar>
+              <w:top w:type="dxa" w:w="120"/>
+              <w:left w:type="dxa" w:w="180"/>
+              <w:bottom w:type="dxa" w:w="120"/>
+              <w:right w:type="dxa" w:w="180"/>
+            </w:tcMar>
+          </w:tcPr>
+          <w:p>
+            <w:r>
+              <w:rPr>
+                <w:rFonts w:ascii="Calibri" w:cs="Calibri" w:eastAsia="Calibri" w:hAnsi="Calibri"/>
+                <w:b w:val="false"/>
+                <w:bCs w:val="false"/>
+                <w:color w:val="334155"/>
+                <w:sz w:val="19"/>
+                <w:szCs w:val="19"/>
+              </w:rPr>
+              <w:t xml:space="preserve">/api/v1/notifications/unread-count</w:t>
+            </w:r>
+          </w:p>
+        </w:tc>
+        <w:tc>
+          <w:tcPr>
+            <w:tcW w:type="pct" w:w="1000"/>
+            <w:tcBorders>
+              <w:top w:val="single" w:color="CBD5E1" w:sz="1"/>
+              <w:left w:val="single" w:color="CBD5E1" w:sz="1"/>
+              <w:bottom w:val="single" w:color="CBD5E1" w:sz="1"/>
+              <w:right w:val="single" w:color="CBD5E1" w:sz="1"/>
+            </w:tcBorders>
+            <w:shd w:fill="F8FAFC" w:val="clear"/>
+            <w:tcMar>
+              <w:top w:type="dxa" w:w="120"/>
+              <w:left w:type="dxa" w:w="180"/>
+              <w:bottom w:type="dxa" w:w="120"/>
+              <w:right w:type="dxa" w:w="180"/>
+            </w:tcMar>
+          </w:tcPr>
+          <w:p>
+            <w:r>
+              <w:rPr>
+                <w:rFonts w:ascii="Calibri" w:cs="Calibri" w:eastAsia="Calibri" w:hAnsi="Calibri"/>
+                <w:b w:val="false"/>
+                <w:bCs w:val="false"/>
+                <w:color w:val="334155"/>
+                <w:sz w:val="19"/>
+                <w:szCs w:val="19"/>
+              </w:rPr>
+              <w:t xml:space="preserve">Authenticated</w:t>
+            </w:r>
+          </w:p>
+        </w:tc>
+        <w:tc>
+          <w:tcPr>
+            <w:tcW w:type="pct" w:w="1500"/>
+            <w:tcBorders>
+              <w:top w:val="single" w:color="CBD5E1" w:sz="1"/>
+              <w:left w:val="single" w:color="CBD5E1" w:sz="1"/>
+              <w:bottom w:val="single" w:color="CBD5E1" w:sz="1"/>
+              <w:right w:val="single" w:color="CBD5E1" w:sz="1"/>
+            </w:tcBorders>
+            <w:shd w:fill="F8FAFC" w:val="clear"/>
+            <w:tcMar>
+              <w:top w:type="dxa" w:w="120"/>
+              <w:left w:type="dxa" w:w="180"/>
+              <w:bottom w:type="dxa" w:w="120"/>
+              <w:right w:type="dxa" w:w="180"/>
+            </w:tcMar>
+          </w:tcPr>
+          <w:p>
+            <w:r>
+              <w:rPr>
+                <w:rFonts w:ascii="Calibri" w:cs="Calibri" w:eastAsia="Calibri" w:hAnsi="Calibri"/>
+                <w:b w:val="false"/>
+                <w:bCs w:val="false"/>
+                <w:color w:val="334155"/>
+                <w:sz w:val="19"/>
+                <w:szCs w:val="19"/>
+              </w:rPr>
+              <w:t xml:space="preserve">Lightweight unread count query for header navigation badge</w:t>
+            </w:r>
+          </w:p>
+        </w:tc>
+      </w:tr>
+      <w:tr>
+        <w:tc>
+          <w:tcPr>
+            <w:tcW w:type="pct" w:w="750"/>
+            <w:tcBorders>
+              <w:top w:val="single" w:color="CBD5E1" w:sz="1"/>
+              <w:left w:val="single" w:color="CBD5E1" w:sz="1"/>
+              <w:bottom w:val="single" w:color="CBD5E1" w:sz="1"/>
+              <w:right w:val="single" w:color="CBD5E1" w:sz="1"/>
+            </w:tcBorders>
+            <w:shd w:fill="FFFFFF" w:val="clear"/>
+            <w:tcMar>
+              <w:top w:type="dxa" w:w="120"/>
+              <w:left w:type="dxa" w:w="180"/>
+              <w:bottom w:type="dxa" w:w="120"/>
+              <w:right w:type="dxa" w:w="180"/>
+            </w:tcMar>
+          </w:tcPr>
+          <w:p>
+            <w:r>
+              <w:rPr>
+                <w:rFonts w:ascii="Calibri" w:cs="Calibri" w:eastAsia="Calibri" w:hAnsi="Calibri"/>
+                <w:b/>
+                <w:bCs/>
+                <w:color w:val="334155"/>
+                <w:sz w:val="19"/>
+                <w:szCs w:val="19"/>
+              </w:rPr>
+              <w:t xml:space="preserve">PATCH</w:t>
+            </w:r>
+          </w:p>
+        </w:tc>
+        <w:tc>
+          <w:tcPr>
+            <w:tcW w:type="pct" w:w="1750"/>
+            <w:tcBorders>
+              <w:top w:val="single" w:color="CBD5E1" w:sz="1"/>
+              <w:left w:val="single" w:color="CBD5E1" w:sz="1"/>
+              <w:bottom w:val="single" w:color="CBD5E1" w:sz="1"/>
+              <w:right w:val="single" w:color="CBD5E1" w:sz="1"/>
+            </w:tcBorders>
+            <w:shd w:fill="FFFFFF" w:val="clear"/>
+            <w:tcMar>
+              <w:top w:type="dxa" w:w="120"/>
+              <w:left w:type="dxa" w:w="180"/>
+              <w:bottom w:type="dxa" w:w="120"/>
+              <w:right w:type="dxa" w:w="180"/>
+            </w:tcMar>
+          </w:tcPr>
+          <w:p>
+            <w:r>
+              <w:rPr>
+                <w:rFonts w:ascii="Calibri" w:cs="Calibri" w:eastAsia="Calibri" w:hAnsi="Calibri"/>
+                <w:b w:val="false"/>
+                <w:bCs w:val="false"/>
+                <w:color w:val="334155"/>
+                <w:sz w:val="19"/>
+                <w:szCs w:val="19"/>
+              </w:rPr>
+              <w:t xml:space="preserve">/api/v1/notifications/:id/read</w:t>
+            </w:r>
+          </w:p>
+        </w:tc>
+        <w:tc>
+          <w:tcPr>
+            <w:tcW w:type="pct" w:w="1000"/>
+            <w:tcBorders>
+              <w:top w:val="single" w:color="CBD5E1" w:sz="1"/>
+              <w:left w:val="single" w:color="CBD5E1" w:sz="1"/>
+              <w:bottom w:val="single" w:color="CBD5E1" w:sz="1"/>
+              <w:right w:val="single" w:color="CBD5E1" w:sz="1"/>
+            </w:tcBorders>
+            <w:shd w:fill="FFFFFF" w:val="clear"/>
+            <w:tcMar>
+              <w:top w:type="dxa" w:w="120"/>
+              <w:left w:type="dxa" w:w="180"/>
+              <w:bottom w:type="dxa" w:w="120"/>
+              <w:right w:type="dxa" w:w="180"/>
+            </w:tcMar>
+          </w:tcPr>
+          <w:p>
+            <w:r>
+              <w:rPr>
+                <w:rFonts w:ascii="Calibri" w:cs="Calibri" w:eastAsia="Calibri" w:hAnsi="Calibri"/>
+                <w:b w:val="false"/>
+                <w:bCs w:val="false"/>
+                <w:color w:val="334155"/>
+                <w:sz w:val="19"/>
+                <w:szCs w:val="19"/>
+              </w:rPr>
+              <w:t xml:space="preserve">Authenticated</w:t>
+            </w:r>
+          </w:p>
+        </w:tc>
+        <w:tc>
+          <w:tcPr>
+            <w:tcW w:type="pct" w:w="1500"/>
+            <w:tcBorders>
+              <w:top w:val="single" w:color="CBD5E1" w:sz="1"/>
+              <w:left w:val="single" w:color="CBD5E1" w:sz="1"/>
+              <w:bottom w:val="single" w:color="CBD5E1" w:sz="1"/>
+              <w:right w:val="single" w:color="CBD5E1" w:sz="1"/>
+            </w:tcBorders>
+            <w:shd w:fill="FFFFFF" w:val="clear"/>
+            <w:tcMar>
+              <w:top w:type="dxa" w:w="120"/>
+              <w:left w:type="dxa" w:w="180"/>
+              <w:bottom w:type="dxa" w:w="120"/>
+              <w:right w:type="dxa" w:w="180"/>
+            </w:tcMar>
+          </w:tcPr>
+          <w:p>
+            <w:r>
+              <w:rPr>
+                <w:rFonts w:ascii="Calibri" w:cs="Calibri" w:eastAsia="Calibri" w:hAnsi="Calibri"/>
+                <w:b w:val="false"/>
+                <w:bCs w:val="false"/>
+                <w:color w:val="334155"/>
+                <w:sz w:val="19"/>
+                <w:szCs w:val="19"/>
+              </w:rPr>
+              <w:t xml:space="preserve">Marks a specific notification as read</w:t>
+            </w:r>
+          </w:p>
+        </w:tc>
+      </w:tr>
+      <w:tr>
+        <w:tc>
+          <w:tcPr>
+            <w:tcW w:type="pct" w:w="750"/>
+            <w:tcBorders>
+              <w:top w:val="single" w:color="CBD5E1" w:sz="1"/>
+              <w:left w:val="single" w:color="CBD5E1" w:sz="1"/>
+              <w:bottom w:val="single" w:color="CBD5E1" w:sz="1"/>
+              <w:right w:val="single" w:color="CBD5E1" w:sz="1"/>
+            </w:tcBorders>
+            <w:shd w:fill="F8FAFC" w:val="clear"/>
+            <w:tcMar>
+              <w:top w:type="dxa" w:w="120"/>
+              <w:left w:type="dxa" w:w="180"/>
+              <w:bottom w:type="dxa" w:w="120"/>
+              <w:right w:type="dxa" w:w="180"/>
+            </w:tcMar>
+          </w:tcPr>
+          <w:p>
+            <w:r>
+              <w:rPr>
+                <w:rFonts w:ascii="Calibri" w:cs="Calibri" w:eastAsia="Calibri" w:hAnsi="Calibri"/>
+                <w:b/>
+                <w:bCs/>
+                <w:color w:val="334155"/>
+                <w:sz w:val="19"/>
+                <w:szCs w:val="19"/>
+              </w:rPr>
+              <w:t xml:space="preserve">PATCH</w:t>
+            </w:r>
+          </w:p>
+        </w:tc>
+        <w:tc>
+          <w:tcPr>
+            <w:tcW w:type="pct" w:w="1750"/>
+            <w:tcBorders>
+              <w:top w:val="single" w:color="CBD5E1" w:sz="1"/>
+              <w:left w:val="single" w:color="CBD5E1" w:sz="1"/>
+              <w:bottom w:val="single" w:color="CBD5E1" w:sz="1"/>
+              <w:right w:val="single" w:color="CBD5E1" w:sz="1"/>
+            </w:tcBorders>
+            <w:shd w:fill="F8FAFC" w:val="clear"/>
+            <w:tcMar>
+              <w:top w:type="dxa" w:w="120"/>
+              <w:left w:type="dxa" w:w="180"/>
+              <w:bottom w:type="dxa" w:w="120"/>
+              <w:right w:type="dxa" w:w="180"/>
+            </w:tcMar>
+          </w:tcPr>
+          <w:p>
+            <w:r>
+              <w:rPr>
+                <w:rFonts w:ascii="Calibri" w:cs="Calibri" w:eastAsia="Calibri" w:hAnsi="Calibri"/>
+                <w:b w:val="false"/>
+                <w:bCs w:val="false"/>
+                <w:color w:val="334155"/>
+                <w:sz w:val="19"/>
+                <w:szCs w:val="19"/>
+              </w:rPr>
+              <w:t xml:space="preserve">/api/v1/notifications/mark-all-read</w:t>
+            </w:r>
+          </w:p>
+        </w:tc>
+        <w:tc>
+          <w:tcPr>
+            <w:tcW w:type="pct" w:w="1000"/>
+            <w:tcBorders>
+              <w:top w:val="single" w:color="CBD5E1" w:sz="1"/>
+              <w:left w:val="single" w:color="CBD5E1" w:sz="1"/>
+              <w:bottom w:val="single" w:color="CBD5E1" w:sz="1"/>
+              <w:right w:val="single" w:color="CBD5E1" w:sz="1"/>
+            </w:tcBorders>
+            <w:shd w:fill="F8FAFC" w:val="clear"/>
+            <w:tcMar>
+              <w:top w:type="dxa" w:w="120"/>
+              <w:left w:type="dxa" w:w="180"/>
+              <w:bottom w:type="dxa" w:w="120"/>
+              <w:right w:type="dxa" w:w="180"/>
+            </w:tcMar>
+          </w:tcPr>
+          <w:p>
+            <w:r>
+              <w:rPr>
+                <w:rFonts w:ascii="Calibri" w:cs="Calibri" w:eastAsia="Calibri" w:hAnsi="Calibri"/>
+                <w:b w:val="false"/>
+                <w:bCs w:val="false"/>
+                <w:color w:val="334155"/>
+                <w:sz w:val="19"/>
+                <w:szCs w:val="19"/>
+              </w:rPr>
+              <w:t xml:space="preserve">Authenticated</w:t>
+            </w:r>
+          </w:p>
+        </w:tc>
+        <w:tc>
+          <w:tcPr>
+            <w:tcW w:type="pct" w:w="1500"/>
+            <w:tcBorders>
+              <w:top w:val="single" w:color="CBD5E1" w:sz="1"/>
+              <w:left w:val="single" w:color="CBD5E1" w:sz="1"/>
+              <w:bottom w:val="single" w:color="CBD5E1" w:sz="1"/>
+              <w:right w:val="single" w:color="CBD5E1" w:sz="1"/>
+            </w:tcBorders>
+            <w:shd w:fill="F8FAFC" w:val="clear"/>
+            <w:tcMar>
+              <w:top w:type="dxa" w:w="120"/>
+              <w:left w:type="dxa" w:w="180"/>
+              <w:bottom w:type="dxa" w:w="120"/>
+              <w:right w:type="dxa" w:w="180"/>
+            </w:tcMar>
+          </w:tcPr>
+          <w:p>
+            <w:r>
+              <w:rPr>
+                <w:rFonts w:ascii="Calibri" w:cs="Calibri" w:eastAsia="Calibri" w:hAnsi="Calibri"/>
+                <w:b w:val="false"/>
+                <w:bCs w:val="false"/>
+                <w:color w:val="334155"/>
+                <w:sz w:val="19"/>
+                <w:szCs w:val="19"/>
+              </w:rPr>
+              <w:t xml:space="preserve">Marks all user notifications as read in single operation</w:t>
+            </w:r>
+          </w:p>
+        </w:tc>
+      </w:tr>
+      <w:tr>
+        <w:tc>
+          <w:tcPr>
+            <w:tcW w:type="pct" w:w="750"/>
+            <w:tcBorders>
+              <w:top w:val="single" w:color="CBD5E1" w:sz="1"/>
+              <w:left w:val="single" w:color="CBD5E1" w:sz="1"/>
+              <w:bottom w:val="single" w:color="CBD5E1" w:sz="1"/>
+              <w:right w:val="single" w:color="CBD5E1" w:sz="1"/>
+            </w:tcBorders>
+            <w:shd w:fill="FFFFFF" w:val="clear"/>
+            <w:tcMar>
+              <w:top w:type="dxa" w:w="120"/>
+              <w:left w:type="dxa" w:w="180"/>
+              <w:bottom w:type="dxa" w:w="120"/>
+              <w:right w:type="dxa" w:w="180"/>
+            </w:tcMar>
+          </w:tcPr>
+          <w:p>
+            <w:r>
+              <w:rPr>
+                <w:rFonts w:ascii="Calibri" w:cs="Calibri" w:eastAsia="Calibri" w:hAnsi="Calibri"/>
+                <w:b/>
+                <w:bCs/>
+                <w:color w:val="334155"/>
+                <w:sz w:val="19"/>
+                <w:szCs w:val="19"/>
+              </w:rPr>
+              <w:t xml:space="preserve">DELETE</w:t>
+            </w:r>
+          </w:p>
+        </w:tc>
+        <w:tc>
+          <w:tcPr>
+            <w:tcW w:type="pct" w:w="1750"/>
+            <w:tcBorders>
+              <w:top w:val="single" w:color="CBD5E1" w:sz="1"/>
+              <w:left w:val="single" w:color="CBD5E1" w:sz="1"/>
+              <w:bottom w:val="single" w:color="CBD5E1" w:sz="1"/>
+              <w:right w:val="single" w:color="CBD5E1" w:sz="1"/>
+            </w:tcBorders>
+            <w:shd w:fill="FFFFFF" w:val="clear"/>
+            <w:tcMar>
+              <w:top w:type="dxa" w:w="120"/>
+              <w:left w:type="dxa" w:w="180"/>
+              <w:bottom w:type="dxa" w:w="120"/>
+              <w:right w:type="dxa" w:w="180"/>
+            </w:tcMar>
+          </w:tcPr>
+          <w:p>
+            <w:r>
+              <w:rPr>
+                <w:rFonts w:ascii="Calibri" w:cs="Calibri" w:eastAsia="Calibri" w:hAnsi="Calibri"/>
+                <w:b w:val="false"/>
+                <w:bCs w:val="false"/>
+                <w:color w:val="334155"/>
+                <w:sz w:val="19"/>
+                <w:szCs w:val="19"/>
+              </w:rPr>
+              <w:t xml:space="preserve">/api/v1/notifications/:id</w:t>
+            </w:r>
+          </w:p>
+        </w:tc>
+        <w:tc>
+          <w:tcPr>
+            <w:tcW w:type="pct" w:w="1000"/>
+            <w:tcBorders>
+              <w:top w:val="single" w:color="CBD5E1" w:sz="1"/>
+              <w:left w:val="single" w:color="CBD5E1" w:sz="1"/>
+              <w:bottom w:val="single" w:color="CBD5E1" w:sz="1"/>
+              <w:right w:val="single" w:color="CBD5E1" w:sz="1"/>
+            </w:tcBorders>
+            <w:shd w:fill="FFFFFF" w:val="clear"/>
+            <w:tcMar>
+              <w:top w:type="dxa" w:w="120"/>
+              <w:left w:type="dxa" w:w="180"/>
+              <w:bottom w:type="dxa" w:w="120"/>
+              <w:right w:type="dxa" w:w="180"/>
+            </w:tcMar>
+          </w:tcPr>
+          <w:p>
+            <w:r>
+              <w:rPr>
+                <w:rFonts w:ascii="Calibri" w:cs="Calibri" w:eastAsia="Calibri" w:hAnsi="Calibri"/>
+                <w:b w:val="false"/>
+                <w:bCs w:val="false"/>
+                <w:color w:val="334155"/>
+                <w:sz w:val="19"/>
+                <w:szCs w:val="19"/>
+              </w:rPr>
+              <w:t xml:space="preserve">Authenticated</w:t>
+            </w:r>
+          </w:p>
+        </w:tc>
+        <w:tc>
+          <w:tcPr>
+            <w:tcW w:type="pct" w:w="1500"/>
+            <w:tcBorders>
+              <w:top w:val="single" w:color="CBD5E1" w:sz="1"/>
+              <w:left w:val="single" w:color="CBD5E1" w:sz="1"/>
+              <w:bottom w:val="single" w:color="CBD5E1" w:sz="1"/>
+              <w:right w:val="single" w:color="CBD5E1" w:sz="1"/>
+            </w:tcBorders>
+            <w:shd w:fill="FFFFFF" w:val="clear"/>
+            <w:tcMar>
+              <w:top w:type="dxa" w:w="120"/>
+              <w:left w:type="dxa" w:w="180"/>
+              <w:bottom w:type="dxa" w:w="120"/>
+              <w:right w:type="dxa" w:w="180"/>
+            </w:tcMar>
+          </w:tcPr>
+          <w:p>
+            <w:r>
+              <w:rPr>
+                <w:rFonts w:ascii="Calibri" w:cs="Calibri" w:eastAsia="Calibri" w:hAnsi="Calibri"/>
+                <w:b w:val="false"/>
+                <w:bCs w:val="false"/>
+                <w:color w:val="334155"/>
+                <w:sz w:val="19"/>
+                <w:szCs w:val="19"/>
+              </w:rPr>
+              <w:t xml:space="preserve">Deletes a single notification record permanently</w:t>
+            </w:r>
+          </w:p>
+        </w:tc>
+      </w:tr>
+      <w:tr>
+        <w:tc>
+          <w:tcPr>
+            <w:tcW w:type="pct" w:w="750"/>
+            <w:tcBorders>
+              <w:top w:val="single" w:color="CBD5E1" w:sz="1"/>
+              <w:left w:val="single" w:color="CBD5E1" w:sz="1"/>
+              <w:bottom w:val="single" w:color="CBD5E1" w:sz="1"/>
+              <w:right w:val="single" w:color="CBD5E1" w:sz="1"/>
+            </w:tcBorders>
+            <w:shd w:fill="F8FAFC" w:val="clear"/>
+            <w:tcMar>
+              <w:top w:type="dxa" w:w="120"/>
+              <w:left w:type="dxa" w:w="180"/>
+              <w:bottom w:type="dxa" w:w="120"/>
+              <w:right w:type="dxa" w:w="180"/>
+            </w:tcMar>
+          </w:tcPr>
+          <w:p>
+            <w:r>
+              <w:rPr>
+                <w:rFonts w:ascii="Calibri" w:cs="Calibri" w:eastAsia="Calibri" w:hAnsi="Calibri"/>
+                <w:b/>
+                <w:bCs/>
+                <w:color w:val="334155"/>
+                <w:sz w:val="19"/>
+                <w:szCs w:val="19"/>
+              </w:rPr>
+              <w:t xml:space="preserve">PATCH</w:t>
+            </w:r>
+          </w:p>
+        </w:tc>
+        <w:tc>
+          <w:tcPr>
+            <w:tcW w:type="pct" w:w="1750"/>
+            <w:tcBorders>
+              <w:top w:val="single" w:color="CBD5E1" w:sz="1"/>
+              <w:left w:val="single" w:color="CBD5E1" w:sz="1"/>
+              <w:bottom w:val="single" w:color="CBD5E1" w:sz="1"/>
+              <w:right w:val="single" w:color="CBD5E1" w:sz="1"/>
+            </w:tcBorders>
+            <w:shd w:fill="F8FAFC" w:val="clear"/>
+            <w:tcMar>
+              <w:top w:type="dxa" w:w="120"/>
+              <w:left w:type="dxa" w:w="180"/>
+              <w:bottom w:type="dxa" w:w="120"/>
+              <w:right w:type="dxa" w:w="180"/>
+            </w:tcMar>
+          </w:tcPr>
+          <w:p>
+            <w:r>
+              <w:rPr>
+                <w:rFonts w:ascii="Calibri" w:cs="Calibri" w:eastAsia="Calibri" w:hAnsi="Calibri"/>
+                <w:b w:val="false"/>
+                <w:bCs w:val="false"/>
+                <w:color w:val="334155"/>
+                <w:sz w:val="19"/>
+                <w:szCs w:val="19"/>
+              </w:rPr>
+              <w:t xml:space="preserve">/api/v1/auth/profile</w:t>
+            </w:r>
+          </w:p>
+        </w:tc>
+        <w:tc>
+          <w:tcPr>
+            <w:tcW w:type="pct" w:w="1000"/>
+            <w:tcBorders>
+              <w:top w:val="single" w:color="CBD5E1" w:sz="1"/>
+              <w:left w:val="single" w:color="CBD5E1" w:sz="1"/>
+              <w:bottom w:val="single" w:color="CBD5E1" w:sz="1"/>
+              <w:right w:val="single" w:color="CBD5E1" w:sz="1"/>
+            </w:tcBorders>
+            <w:shd w:fill="F8FAFC" w:val="clear"/>
+            <w:tcMar>
+              <w:top w:type="dxa" w:w="120"/>
+              <w:left w:type="dxa" w:w="180"/>
+              <w:bottom w:type="dxa" w:w="120"/>
+              <w:right w:type="dxa" w:w="180"/>
+            </w:tcMar>
+          </w:tcPr>
+          <w:p>
+            <w:r>
+              <w:rPr>
+                <w:rFonts w:ascii="Calibri" w:cs="Calibri" w:eastAsia="Calibri" w:hAnsi="Calibri"/>
+                <w:b w:val="false"/>
+                <w:bCs w:val="false"/>
+                <w:color w:val="334155"/>
+                <w:sz w:val="19"/>
+                <w:szCs w:val="19"/>
+              </w:rPr>
+              <w:t xml:space="preserve">Authenticated</w:t>
+            </w:r>
+          </w:p>
+        </w:tc>
+        <w:tc>
+          <w:tcPr>
+            <w:tcW w:type="pct" w:w="1500"/>
+            <w:tcBorders>
+              <w:top w:val="single" w:color="CBD5E1" w:sz="1"/>
+              <w:left w:val="single" w:color="CBD5E1" w:sz="1"/>
+              <w:bottom w:val="single" w:color="CBD5E1" w:sz="1"/>
+              <w:right w:val="single" w:color="CBD5E1" w:sz="1"/>
+            </w:tcBorders>
+            <w:shd w:fill="F8FAFC" w:val="clear"/>
+            <w:tcMar>
+              <w:top w:type="dxa" w:w="120"/>
+              <w:left w:type="dxa" w:w="180"/>
+              <w:bottom w:type="dxa" w:w="120"/>
+              <w:right w:type="dxa" w:w="180"/>
+            </w:tcMar>
+          </w:tcPr>
+          <w:p>
+            <w:r>
+              <w:rPr>
+                <w:rFonts w:ascii="Calibri" w:cs="Calibri" w:eastAsia="Calibri" w:hAnsi="Calibri"/>
+                <w:b w:val="false"/>
+                <w:bCs w:val="false"/>
+                <w:color w:val="334155"/>
+                <w:sz w:val="19"/>
+                <w:szCs w:val="19"/>
+              </w:rPr>
+              <w:t xml:space="preserve">Updates profile fields (firstName, lastName, phone, avatar)</w:t>
+            </w:r>
+          </w:p>
+        </w:tc>
+      </w:tr>
+      <w:tr>
+        <w:tc>
+          <w:tcPr>
+            <w:tcW w:type="pct" w:w="750"/>
+            <w:tcBorders>
+              <w:top w:val="single" w:color="CBD5E1" w:sz="1"/>
+              <w:left w:val="single" w:color="CBD5E1" w:sz="1"/>
+              <w:bottom w:val="single" w:color="CBD5E1" w:sz="1"/>
+              <w:right w:val="single" w:color="CBD5E1" w:sz="1"/>
+            </w:tcBorders>
+            <w:shd w:fill="FFFFFF" w:val="clear"/>
+            <w:tcMar>
+              <w:top w:type="dxa" w:w="120"/>
+              <w:left w:type="dxa" w:w="180"/>
+              <w:bottom w:type="dxa" w:w="120"/>
+              <w:right w:type="dxa" w:w="180"/>
+            </w:tcMar>
+          </w:tcPr>
+          <w:p>
+            <w:r>
+              <w:rPr>
+                <w:rFonts w:ascii="Calibri" w:cs="Calibri" w:eastAsia="Calibri" w:hAnsi="Calibri"/>
+                <w:b/>
+                <w:bCs/>
+                <w:color w:val="334155"/>
+                <w:sz w:val="19"/>
+                <w:szCs w:val="19"/>
+              </w:rPr>
+              <w:t xml:space="preserve">PATCH</w:t>
+            </w:r>
+          </w:p>
+        </w:tc>
+        <w:tc>
+          <w:tcPr>
+            <w:tcW w:type="pct" w:w="1750"/>
+            <w:tcBorders>
+              <w:top w:val="single" w:color="CBD5E1" w:sz="1"/>
+              <w:left w:val="single" w:color="CBD5E1" w:sz="1"/>
+              <w:bottom w:val="single" w:color="CBD5E1" w:sz="1"/>
+              <w:right w:val="single" w:color="CBD5E1" w:sz="1"/>
+            </w:tcBorders>
+            <w:shd w:fill="FFFFFF" w:val="clear"/>
+            <w:tcMar>
+              <w:top w:type="dxa" w:w="120"/>
+              <w:left w:type="dxa" w:w="180"/>
+              <w:bottom w:type="dxa" w:w="120"/>
+              <w:right w:type="dxa" w:w="180"/>
+            </w:tcMar>
+          </w:tcPr>
+          <w:p>
+            <w:r>
+              <w:rPr>
+                <w:rFonts w:ascii="Calibri" w:cs="Calibri" w:eastAsia="Calibri" w:hAnsi="Calibri"/>
+                <w:b w:val="false"/>
+                <w:bCs w:val="false"/>
+                <w:color w:val="334155"/>
+                <w:sz w:val="19"/>
+                <w:szCs w:val="19"/>
+              </w:rPr>
+              <w:t xml:space="preserve">/api/v1/auth/change-password</w:t>
+            </w:r>
+          </w:p>
+        </w:tc>
+        <w:tc>
+          <w:tcPr>
+            <w:tcW w:type="pct" w:w="1000"/>
+            <w:tcBorders>
+              <w:top w:val="single" w:color="CBD5E1" w:sz="1"/>
+              <w:left w:val="single" w:color="CBD5E1" w:sz="1"/>
+              <w:bottom w:val="single" w:color="CBD5E1" w:sz="1"/>
+              <w:right w:val="single" w:color="CBD5E1" w:sz="1"/>
+            </w:tcBorders>
+            <w:shd w:fill="FFFFFF" w:val="clear"/>
+            <w:tcMar>
+              <w:top w:type="dxa" w:w="120"/>
+              <w:left w:type="dxa" w:w="180"/>
+              <w:bottom w:type="dxa" w:w="120"/>
+              <w:right w:type="dxa" w:w="180"/>
+            </w:tcMar>
+          </w:tcPr>
+          <w:p>
+            <w:r>
+              <w:rPr>
+                <w:rFonts w:ascii="Calibri" w:cs="Calibri" w:eastAsia="Calibri" w:hAnsi="Calibri"/>
+                <w:b w:val="false"/>
+                <w:bCs w:val="false"/>
+                <w:color w:val="334155"/>
+                <w:sz w:val="19"/>
+                <w:szCs w:val="19"/>
+              </w:rPr>
+              <w:t xml:space="preserve">Authenticated</w:t>
+            </w:r>
+          </w:p>
+        </w:tc>
+        <w:tc>
+          <w:tcPr>
+            <w:tcW w:type="pct" w:w="1500"/>
+            <w:tcBorders>
+              <w:top w:val="single" w:color="CBD5E1" w:sz="1"/>
+              <w:left w:val="single" w:color="CBD5E1" w:sz="1"/>
+              <w:bottom w:val="single" w:color="CBD5E1" w:sz="1"/>
+              <w:right w:val="single" w:color="CBD5E1" w:sz="1"/>
+            </w:tcBorders>
+            <w:shd w:fill="FFFFFF" w:val="clear"/>
+            <w:tcMar>
+              <w:top w:type="dxa" w:w="120"/>
+              <w:left w:type="dxa" w:w="180"/>
+              <w:bottom w:type="dxa" w:w="120"/>
+              <w:right w:type="dxa" w:w="180"/>
+            </w:tcMar>
+          </w:tcPr>
+          <w:p>
+            <w:r>
+              <w:rPr>
+                <w:rFonts w:ascii="Calibri" w:cs="Calibri" w:eastAsia="Calibri" w:hAnsi="Calibri"/>
+                <w:b w:val="false"/>
+                <w:bCs w:val="false"/>
+                <w:color w:val="334155"/>
+                <w:sz w:val="19"/>
+                <w:szCs w:val="19"/>
+              </w:rPr>
+              <w:t xml:space="preserve">Validates current password and sets new password</w:t>
+            </w:r>
+          </w:p>
+        </w:tc>
+      </w:tr>
+      <w:tr>
+        <w:tc>
+          <w:tcPr>
+            <w:tcW w:type="pct" w:w="750"/>
+            <w:tcBorders>
+              <w:top w:val="single" w:color="CBD5E1" w:sz="1"/>
+              <w:left w:val="single" w:color="CBD5E1" w:sz="1"/>
+              <w:bottom w:val="single" w:color="CBD5E1" w:sz="1"/>
+              <w:right w:val="single" w:color="CBD5E1" w:sz="1"/>
+            </w:tcBorders>
+            <w:shd w:fill="F8FAFC" w:val="clear"/>
+            <w:tcMar>
+              <w:top w:type="dxa" w:w="120"/>
+              <w:left w:type="dxa" w:w="180"/>
+              <w:bottom w:type="dxa" w:w="120"/>
+              <w:right w:type="dxa" w:w="180"/>
+            </w:tcMar>
+          </w:tcPr>
+          <w:p>
+            <w:r>
+              <w:rPr>
+                <w:rFonts w:ascii="Calibri" w:cs="Calibri" w:eastAsia="Calibri" w:hAnsi="Calibri"/>
+                <w:b/>
+                <w:bCs/>
+                <w:color w:val="334155"/>
+                <w:sz w:val="19"/>
+                <w:szCs w:val="19"/>
+              </w:rPr>
+              <w:t xml:space="preserve">GET</w:t>
+            </w:r>
+          </w:p>
+        </w:tc>
+        <w:tc>
+          <w:tcPr>
+            <w:tcW w:type="pct" w:w="1750"/>
+            <w:tcBorders>
+              <w:top w:val="single" w:color="CBD5E1" w:sz="1"/>
+              <w:left w:val="single" w:color="CBD5E1" w:sz="1"/>
+              <w:bottom w:val="single" w:color="CBD5E1" w:sz="1"/>
+              <w:right w:val="single" w:color="CBD5E1" w:sz="1"/>
+            </w:tcBorders>
+            <w:shd w:fill="F8FAFC" w:val="clear"/>
+            <w:tcMar>
+              <w:top w:type="dxa" w:w="120"/>
+              <w:left w:type="dxa" w:w="180"/>
+              <w:bottom w:type="dxa" w:w="120"/>
+              <w:right w:type="dxa" w:w="180"/>
+            </w:tcMar>
+          </w:tcPr>
+          <w:p>
+            <w:r>
+              <w:rPr>
+                <w:rFonts w:ascii="Calibri" w:cs="Calibri" w:eastAsia="Calibri" w:hAnsi="Calibri"/>
+                <w:b w:val="false"/>
+                <w:bCs w:val="false"/>
+                <w:color w:val="334155"/>
+                <w:sz w:val="19"/>
+                <w:szCs w:val="19"/>
+              </w:rPr>
+              <w:t xml:space="preserve">/api/v1/auth/sessions</w:t>
+            </w:r>
+          </w:p>
+        </w:tc>
+        <w:tc>
+          <w:tcPr>
+            <w:tcW w:type="pct" w:w="1000"/>
+            <w:tcBorders>
+              <w:top w:val="single" w:color="CBD5E1" w:sz="1"/>
+              <w:left w:val="single" w:color="CBD5E1" w:sz="1"/>
+              <w:bottom w:val="single" w:color="CBD5E1" w:sz="1"/>
+              <w:right w:val="single" w:color="CBD5E1" w:sz="1"/>
+            </w:tcBorders>
+            <w:shd w:fill="F8FAFC" w:val="clear"/>
+            <w:tcMar>
+              <w:top w:type="dxa" w:w="120"/>
+              <w:left w:type="dxa" w:w="180"/>
+              <w:bottom w:type="dxa" w:w="120"/>
+              <w:right w:type="dxa" w:w="180"/>
+            </w:tcMar>
+          </w:tcPr>
+          <w:p>
+            <w:r>
+              <w:rPr>
+                <w:rFonts w:ascii="Calibri" w:cs="Calibri" w:eastAsia="Calibri" w:hAnsi="Calibri"/>
+                <w:b w:val="false"/>
+                <w:bCs w:val="false"/>
+                <w:color w:val="334155"/>
+                <w:sz w:val="19"/>
+                <w:szCs w:val="19"/>
+              </w:rPr>
+              <w:t xml:space="preserve">Authenticated</w:t>
+            </w:r>
+          </w:p>
+        </w:tc>
+        <w:tc>
+          <w:tcPr>
+            <w:tcW w:type="pct" w:w="1500"/>
+            <w:tcBorders>
+              <w:top w:val="single" w:color="CBD5E1" w:sz="1"/>
+              <w:left w:val="single" w:color="CBD5E1" w:sz="1"/>
+              <w:bottom w:val="single" w:color="CBD5E1" w:sz="1"/>
+              <w:right w:val="single" w:color="CBD5E1" w:sz="1"/>
+            </w:tcBorders>
+            <w:shd w:fill="F8FAFC" w:val="clear"/>
+            <w:tcMar>
+              <w:top w:type="dxa" w:w="120"/>
+              <w:left w:type="dxa" w:w="180"/>
+              <w:bottom w:type="dxa" w:w="120"/>
+              <w:right w:type="dxa" w:w="180"/>
+            </w:tcMar>
+          </w:tcPr>
+          <w:p>
+            <w:r>
+              <w:rPr>
+                <w:rFonts w:ascii="Calibri" w:cs="Calibri" w:eastAsia="Calibri" w:hAnsi="Calibri"/>
+                <w:b w:val="false"/>
+                <w:bCs w:val="false"/>
+                <w:color w:val="334155"/>
+                <w:sz w:val="19"/>
+                <w:szCs w:val="19"/>
+              </w:rPr>
+              <w:t xml:space="preserve">Lists all active device sessions with browser/IP details</w:t>
+            </w:r>
+          </w:p>
+        </w:tc>
+      </w:tr>
+      <w:tr>
+        <w:tc>
+          <w:tcPr>
+            <w:tcW w:type="pct" w:w="750"/>
+            <w:tcBorders>
+              <w:top w:val="single" w:color="CBD5E1" w:sz="1"/>
+              <w:left w:val="single" w:color="CBD5E1" w:sz="1"/>
+              <w:bottom w:val="single" w:color="CBD5E1" w:sz="1"/>
+              <w:right w:val="single" w:color="CBD5E1" w:sz="1"/>
+            </w:tcBorders>
+            <w:shd w:fill="FFFFFF" w:val="clear"/>
+            <w:tcMar>
+              <w:top w:type="dxa" w:w="120"/>
+              <w:left w:type="dxa" w:w="180"/>
+              <w:bottom w:type="dxa" w:w="120"/>
+              <w:right w:type="dxa" w:w="180"/>
+            </w:tcMar>
+          </w:tcPr>
+          <w:p>
+            <w:r>
+              <w:rPr>
+                <w:rFonts w:ascii="Calibri" w:cs="Calibri" w:eastAsia="Calibri" w:hAnsi="Calibri"/>
+                <w:b/>
+                <w:bCs/>
+                <w:color w:val="334155"/>
+                <w:sz w:val="19"/>
+                <w:szCs w:val="19"/>
+              </w:rPr>
+              <w:t xml:space="preserve">DELETE</w:t>
+            </w:r>
+          </w:p>
+        </w:tc>
+        <w:tc>
+          <w:tcPr>
+            <w:tcW w:type="pct" w:w="1750"/>
+            <w:tcBorders>
+              <w:top w:val="single" w:color="CBD5E1" w:sz="1"/>
+              <w:left w:val="single" w:color="CBD5E1" w:sz="1"/>
+              <w:bottom w:val="single" w:color="CBD5E1" w:sz="1"/>
+              <w:right w:val="single" w:color="CBD5E1" w:sz="1"/>
+            </w:tcBorders>
+            <w:shd w:fill="FFFFFF" w:val="clear"/>
+            <w:tcMar>
+              <w:top w:type="dxa" w:w="120"/>
+              <w:left w:type="dxa" w:w="180"/>
+              <w:bottom w:type="dxa" w:w="120"/>
+              <w:right w:type="dxa" w:w="180"/>
+            </w:tcMar>
+          </w:tcPr>
+          <w:p>
+            <w:r>
+              <w:rPr>
+                <w:rFonts w:ascii="Calibri" w:cs="Calibri" w:eastAsia="Calibri" w:hAnsi="Calibri"/>
+                <w:b w:val="false"/>
+                <w:bCs w:val="false"/>
+                <w:color w:val="334155"/>
+                <w:sz w:val="19"/>
+                <w:szCs w:val="19"/>
+              </w:rPr>
+              <w:t xml:space="preserve">/api/v1/auth/sessions/:id</w:t>
+            </w:r>
+          </w:p>
+        </w:tc>
+        <w:tc>
+          <w:tcPr>
+            <w:tcW w:type="pct" w:w="1000"/>
+            <w:tcBorders>
+              <w:top w:val="single" w:color="CBD5E1" w:sz="1"/>
+              <w:left w:val="single" w:color="CBD5E1" w:sz="1"/>
+              <w:bottom w:val="single" w:color="CBD5E1" w:sz="1"/>
+              <w:right w:val="single" w:color="CBD5E1" w:sz="1"/>
+            </w:tcBorders>
+            <w:shd w:fill="FFFFFF" w:val="clear"/>
+            <w:tcMar>
+              <w:top w:type="dxa" w:w="120"/>
+              <w:left w:type="dxa" w:w="180"/>
+              <w:bottom w:type="dxa" w:w="120"/>
+              <w:right w:type="dxa" w:w="180"/>
+            </w:tcMar>
+          </w:tcPr>
+          <w:p>
+            <w:r>
+              <w:rPr>
+                <w:rFonts w:ascii="Calibri" w:cs="Calibri" w:eastAsia="Calibri" w:hAnsi="Calibri"/>
+                <w:b w:val="false"/>
+                <w:bCs w:val="false"/>
+                <w:color w:val="334155"/>
+                <w:sz w:val="19"/>
+                <w:szCs w:val="19"/>
+              </w:rPr>
+              <w:t xml:space="preserve">Authenticated</w:t>
+            </w:r>
+          </w:p>
+        </w:tc>
+        <w:tc>
+          <w:tcPr>
+            <w:tcW w:type="pct" w:w="1500"/>
+            <w:tcBorders>
+              <w:top w:val="single" w:color="CBD5E1" w:sz="1"/>
+              <w:left w:val="single" w:color="CBD5E1" w:sz="1"/>
+              <w:bottom w:val="single" w:color="CBD5E1" w:sz="1"/>
+              <w:right w:val="single" w:color="CBD5E1" w:sz="1"/>
+            </w:tcBorders>
+            <w:shd w:fill="FFFFFF" w:val="clear"/>
+            <w:tcMar>
+              <w:top w:type="dxa" w:w="120"/>
+              <w:left w:type="dxa" w:w="180"/>
+              <w:bottom w:type="dxa" w:w="120"/>
+              <w:right w:type="dxa" w:w="180"/>
+            </w:tcMar>
+          </w:tcPr>
+          <w:p>
+            <w:r>
+              <w:rPr>
+                <w:rFonts w:ascii="Calibri" w:cs="Calibri" w:eastAsia="Calibri" w:hAnsi="Calibri"/>
+                <w:b w:val="false"/>
+                <w:bCs w:val="false"/>
+                <w:color w:val="334155"/>
+                <w:sz w:val="19"/>
+                <w:szCs w:val="19"/>
+              </w:rPr>
+              <w:t xml:space="preserve">Revokes a specific remote device session</w:t>
+            </w:r>
+          </w:p>
+        </w:tc>
+      </w:tr>
+      <w:tr>
+        <w:tc>
+          <w:tcPr>
+            <w:tcW w:type="pct" w:w="750"/>
+            <w:tcBorders>
+              <w:top w:val="single" w:color="CBD5E1" w:sz="1"/>
+              <w:left w:val="single" w:color="CBD5E1" w:sz="1"/>
+              <w:bottom w:val="single" w:color="CBD5E1" w:sz="1"/>
+              <w:right w:val="single" w:color="CBD5E1" w:sz="1"/>
+            </w:tcBorders>
+            <w:shd w:fill="F8FAFC" w:val="clear"/>
+            <w:tcMar>
+              <w:top w:type="dxa" w:w="120"/>
+              <w:left w:type="dxa" w:w="180"/>
+              <w:bottom w:type="dxa" w:w="120"/>
+              <w:right w:type="dxa" w:w="180"/>
+            </w:tcMar>
+          </w:tcPr>
+          <w:p>
+            <w:r>
+              <w:rPr>
+                <w:rFonts w:ascii="Calibri" w:cs="Calibri" w:eastAsia="Calibri" w:hAnsi="Calibri"/>
+                <w:b/>
+                <w:bCs/>
+                <w:color w:val="334155"/>
+                <w:sz w:val="19"/>
+                <w:szCs w:val="19"/>
+              </w:rPr>
+              <w:t xml:space="preserve">DELETE</w:t>
+            </w:r>
+          </w:p>
+        </w:tc>
+        <w:tc>
+          <w:tcPr>
+            <w:tcW w:type="pct" w:w="1750"/>
+            <w:tcBorders>
+              <w:top w:val="single" w:color="CBD5E1" w:sz="1"/>
+              <w:left w:val="single" w:color="CBD5E1" w:sz="1"/>
+              <w:bottom w:val="single" w:color="CBD5E1" w:sz="1"/>
+              <w:right w:val="single" w:color="CBD5E1" w:sz="1"/>
+            </w:tcBorders>
+            <w:shd w:fill="F8FAFC" w:val="clear"/>
+            <w:tcMar>
+              <w:top w:type="dxa" w:w="120"/>
+              <w:left w:type="dxa" w:w="180"/>
+              <w:bottom w:type="dxa" w:w="120"/>
+              <w:right w:type="dxa" w:w="180"/>
+            </w:tcMar>
+          </w:tcPr>
+          <w:p>
+            <w:r>
+              <w:rPr>
+                <w:rFonts w:ascii="Calibri" w:cs="Calibri" w:eastAsia="Calibri" w:hAnsi="Calibri"/>
+                <w:b w:val="false"/>
+                <w:bCs w:val="false"/>
+                <w:color w:val="334155"/>
+                <w:sz w:val="19"/>
+                <w:szCs w:val="19"/>
+              </w:rPr>
+              <w:t xml:space="preserve">/api/v1/auth/sessions</w:t>
+            </w:r>
+          </w:p>
+        </w:tc>
+        <w:tc>
+          <w:tcPr>
+            <w:tcW w:type="pct" w:w="1000"/>
+            <w:tcBorders>
+              <w:top w:val="single" w:color="CBD5E1" w:sz="1"/>
+              <w:left w:val="single" w:color="CBD5E1" w:sz="1"/>
+              <w:bottom w:val="single" w:color="CBD5E1" w:sz="1"/>
+              <w:right w:val="single" w:color="CBD5E1" w:sz="1"/>
+            </w:tcBorders>
+            <w:shd w:fill="F8FAFC" w:val="clear"/>
+            <w:tcMar>
+              <w:top w:type="dxa" w:w="120"/>
+              <w:left w:type="dxa" w:w="180"/>
+              <w:bottom w:type="dxa" w:w="120"/>
+              <w:right w:type="dxa" w:w="180"/>
+            </w:tcMar>
+          </w:tcPr>
+          <w:p>
+            <w:r>
+              <w:rPr>
+                <w:rFonts w:ascii="Calibri" w:cs="Calibri" w:eastAsia="Calibri" w:hAnsi="Calibri"/>
+                <w:b w:val="false"/>
+                <w:bCs w:val="false"/>
+                <w:color w:val="334155"/>
+                <w:sz w:val="19"/>
+                <w:szCs w:val="19"/>
+              </w:rPr>
+              <w:t xml:space="preserve">Authenticated</w:t>
+            </w:r>
+          </w:p>
+        </w:tc>
+        <w:tc>
+          <w:tcPr>
+            <w:tcW w:type="pct" w:w="1500"/>
+            <w:tcBorders>
+              <w:top w:val="single" w:color="CBD5E1" w:sz="1"/>
+              <w:left w:val="single" w:color="CBD5E1" w:sz="1"/>
+              <w:bottom w:val="single" w:color="CBD5E1" w:sz="1"/>
+              <w:right w:val="single" w:color="CBD5E1" w:sz="1"/>
+            </w:tcBorders>
+            <w:shd w:fill="F8FAFC" w:val="clear"/>
+            <w:tcMar>
+              <w:top w:type="dxa" w:w="120"/>
+              <w:left w:type="dxa" w:w="180"/>
+              <w:bottom w:type="dxa" w:w="120"/>
+              <w:right w:type="dxa" w:w="180"/>
+            </w:tcMar>
+          </w:tcPr>
+          <w:p>
+            <w:r>
+              <w:rPr>
+                <w:rFonts w:ascii="Calibri" w:cs="Calibri" w:eastAsia="Calibri" w:hAnsi="Calibri"/>
+                <w:b w:val="false"/>
+                <w:bCs w:val="false"/>
+                <w:color w:val="334155"/>
+                <w:sz w:val="19"/>
+                <w:szCs w:val="19"/>
+              </w:rPr>
+              <w:t xml:space="preserve">Revokes all other active sessions across user devices</w:t>
+            </w:r>
+          </w:p>
+        </w:tc>
+      </w:tr>
     </w:tbl>
     <w:p>
       <w:pPr>
@@ -5896,6 +7638,196 @@
           </w:p>
         </w:tc>
       </w:tr>
+      <w:tr>
+        <w:tc>
+          <w:tcPr>
+            <w:tcW w:type="pct" w:w="1000"/>
+            <w:tcBorders>
+              <w:top w:val="single" w:color="CBD5E1" w:sz="1"/>
+              <w:left w:val="single" w:color="CBD5E1" w:sz="1"/>
+              <w:bottom w:val="single" w:color="CBD5E1" w:sz="1"/>
+              <w:right w:val="single" w:color="CBD5E1" w:sz="1"/>
+            </w:tcBorders>
+            <w:shd w:fill="F8FAFC" w:val="clear"/>
+            <w:tcMar>
+              <w:top w:type="dxa" w:w="120"/>
+              <w:left w:type="dxa" w:w="180"/>
+              <w:bottom w:type="dxa" w:w="120"/>
+              <w:right w:type="dxa" w:w="180"/>
+            </w:tcMar>
+          </w:tcPr>
+          <w:p>
+            <w:r>
+              <w:rPr>
+                <w:rFonts w:ascii="Calibri" w:cs="Calibri" w:eastAsia="Calibri" w:hAnsi="Calibri"/>
+                <w:b/>
+                <w:bCs/>
+                <w:color w:val="334155"/>
+                <w:sz w:val="19"/>
+                <w:szCs w:val="19"/>
+              </w:rPr>
+              <w:t xml:space="preserve">Notification</w:t>
+            </w:r>
+          </w:p>
+        </w:tc>
+        <w:tc>
+          <w:tcPr>
+            <w:tcW w:type="pct" w:w="2250"/>
+            <w:tcBorders>
+              <w:top w:val="single" w:color="CBD5E1" w:sz="1"/>
+              <w:left w:val="single" w:color="CBD5E1" w:sz="1"/>
+              <w:bottom w:val="single" w:color="CBD5E1" w:sz="1"/>
+              <w:right w:val="single" w:color="CBD5E1" w:sz="1"/>
+            </w:tcBorders>
+            <w:shd w:fill="F8FAFC" w:val="clear"/>
+            <w:tcMar>
+              <w:top w:type="dxa" w:w="120"/>
+              <w:left w:type="dxa" w:w="180"/>
+              <w:bottom w:type="dxa" w:w="120"/>
+              <w:right w:type="dxa" w:w="180"/>
+            </w:tcMar>
+          </w:tcPr>
+          <w:p>
+            <w:r>
+              <w:rPr>
+                <w:rFonts w:ascii="Calibri" w:cs="Calibri" w:eastAsia="Calibri" w:hAnsi="Calibri"/>
+                <w:b w:val="false"/>
+                <w:bCs w:val="false"/>
+                <w:color w:val="334155"/>
+                <w:sz w:val="19"/>
+                <w:szCs w:val="19"/>
+              </w:rPr>
+              <w:t xml:space="preserve">tenantId, userId, title, message, type, link, isRead, readAt, metadata</w:t>
+            </w:r>
+          </w:p>
+        </w:tc>
+        <w:tc>
+          <w:tcPr>
+            <w:tcW w:type="pct" w:w="1750"/>
+            <w:tcBorders>
+              <w:top w:val="single" w:color="CBD5E1" w:sz="1"/>
+              <w:left w:val="single" w:color="CBD5E1" w:sz="1"/>
+              <w:bottom w:val="single" w:color="CBD5E1" w:sz="1"/>
+              <w:right w:val="single" w:color="CBD5E1" w:sz="1"/>
+            </w:tcBorders>
+            <w:shd w:fill="F8FAFC" w:val="clear"/>
+            <w:tcMar>
+              <w:top w:type="dxa" w:w="120"/>
+              <w:left w:type="dxa" w:w="180"/>
+              <w:bottom w:type="dxa" w:w="120"/>
+              <w:right w:type="dxa" w:w="180"/>
+            </w:tcMar>
+          </w:tcPr>
+          <w:p>
+            <w:r>
+              <w:rPr>
+                <w:rFonts w:ascii="Calibri" w:cs="Calibri" w:eastAsia="Calibri" w:hAnsi="Calibri"/>
+                <w:b w:val="false"/>
+                <w:bCs w:val="false"/>
+                <w:color w:val="334155"/>
+                <w:sz w:val="19"/>
+                <w:szCs w:val="19"/>
+              </w:rPr>
+              <w:t xml:space="preserve">Compound index on (tenantId, userId, isRead, createdAt)</w:t>
+            </w:r>
+          </w:p>
+        </w:tc>
+      </w:tr>
+      <w:tr>
+        <w:tc>
+          <w:tcPr>
+            <w:tcW w:type="pct" w:w="1000"/>
+            <w:tcBorders>
+              <w:top w:val="single" w:color="CBD5E1" w:sz="1"/>
+              <w:left w:val="single" w:color="CBD5E1" w:sz="1"/>
+              <w:bottom w:val="single" w:color="CBD5E1" w:sz="1"/>
+              <w:right w:val="single" w:color="CBD5E1" w:sz="1"/>
+            </w:tcBorders>
+            <w:shd w:fill="FFFFFF" w:val="clear"/>
+            <w:tcMar>
+              <w:top w:type="dxa" w:w="120"/>
+              <w:left w:type="dxa" w:w="180"/>
+              <w:bottom w:type="dxa" w:w="120"/>
+              <w:right w:type="dxa" w:w="180"/>
+            </w:tcMar>
+          </w:tcPr>
+          <w:p>
+            <w:r>
+              <w:rPr>
+                <w:rFonts w:ascii="Calibri" w:cs="Calibri" w:eastAsia="Calibri" w:hAnsi="Calibri"/>
+                <w:b/>
+                <w:bCs/>
+                <w:color w:val="334155"/>
+                <w:sz w:val="19"/>
+                <w:szCs w:val="19"/>
+              </w:rPr>
+              <w:t xml:space="preserve">Session</w:t>
+            </w:r>
+          </w:p>
+        </w:tc>
+        <w:tc>
+          <w:tcPr>
+            <w:tcW w:type="pct" w:w="2250"/>
+            <w:tcBorders>
+              <w:top w:val="single" w:color="CBD5E1" w:sz="1"/>
+              <w:left w:val="single" w:color="CBD5E1" w:sz="1"/>
+              <w:bottom w:val="single" w:color="CBD5E1" w:sz="1"/>
+              <w:right w:val="single" w:color="CBD5E1" w:sz="1"/>
+            </w:tcBorders>
+            <w:shd w:fill="FFFFFF" w:val="clear"/>
+            <w:tcMar>
+              <w:top w:type="dxa" w:w="120"/>
+              <w:left w:type="dxa" w:w="180"/>
+              <w:bottom w:type="dxa" w:w="120"/>
+              <w:right w:type="dxa" w:w="180"/>
+            </w:tcMar>
+          </w:tcPr>
+          <w:p>
+            <w:r>
+              <w:rPr>
+                <w:rFonts w:ascii="Calibri" w:cs="Calibri" w:eastAsia="Calibri" w:hAnsi="Calibri"/>
+                <w:b w:val="false"/>
+                <w:bCs w:val="false"/>
+                <w:color w:val="334155"/>
+                <w:sz w:val="19"/>
+                <w:szCs w:val="19"/>
+              </w:rPr>
+              <w:t xml:space="preserve">tenantId, userId, refreshTokenHash, ipAddress, userAgent, isValid, expiresAt, lastActiveAt</w:t>
+            </w:r>
+          </w:p>
+        </w:tc>
+        <w:tc>
+          <w:tcPr>
+            <w:tcW w:type="pct" w:w="1750"/>
+            <w:tcBorders>
+              <w:top w:val="single" w:color="CBD5E1" w:sz="1"/>
+              <w:left w:val="single" w:color="CBD5E1" w:sz="1"/>
+              <w:bottom w:val="single" w:color="CBD5E1" w:sz="1"/>
+              <w:right w:val="single" w:color="CBD5E1" w:sz="1"/>
+            </w:tcBorders>
+            <w:shd w:fill="FFFFFF" w:val="clear"/>
+            <w:tcMar>
+              <w:top w:type="dxa" w:w="120"/>
+              <w:left w:type="dxa" w:w="180"/>
+              <w:bottom w:type="dxa" w:w="120"/>
+              <w:right w:type="dxa" w:w="180"/>
+            </w:tcMar>
+          </w:tcPr>
+          <w:p>
+            <w:r>
+              <w:rPr>
+                <w:rFonts w:ascii="Calibri" w:cs="Calibri" w:eastAsia="Calibri" w:hAnsi="Calibri"/>
+                <w:b w:val="false"/>
+                <w:bCs w:val="false"/>
+                <w:color w:val="334155"/>
+                <w:sz w:val="19"/>
+                <w:szCs w:val="19"/>
+              </w:rPr>
+              <w:t xml:space="preserve">Compound index on (userId, isValid); TTL index on expiresAt</w:t>
+            </w:r>
+          </w:p>
+        </w:tc>
+      </w:tr>
     </w:tbl>
     <w:p>
       <w:pPr>
@@ -6400,7 +8332,7 @@
                 <w:sz w:val="20"/>
                 <w:szCs w:val="20"/>
               </w:rPr>
-              <w:t xml:space="preserve">"NexusCRM is a full-stack, enterprise-grade B2B SaaS platform engineered using the MERN stack and React 18. Unlike academic prototype CRMs that only support basic CRUD forms, NexusCRM implements real-world enterprise patterns: strict multi-tenant boundary isolation, automated AI lead scoring, drag-and-drop Kanban revenue pipelines, quotation discount approvals with on-the-fly PDFKit document streaming, email marketing tracking pixels, and immutable audit logs. The application is backed by an automated 87-test suite and deployed across distributed cloud infrastructure."</w:t>
+              <w:t xml:space="preserve">"NexusCRM is a full-stack, enterprise-grade B2B SaaS platform engineered using the MERN stack and React 18. Unlike academic prototype CRMs that only support basic CRUD forms, NexusCRM implements real-world enterprise patterns: strict multi-tenant boundary isolation, automated AI lead scoring, drag-and-drop Kanban revenue pipelines, quotation discount approvals with on-the-fly PDFKit document streaming, email marketing tracking pixels, an interactive in-app notification center, active session governance with remote revocation, and immutable audit logs. The application is backed by an automated 97-test suite across 12 test suites and deployed across distributed cloud infrastructure."</w:t>
             </w:r>
           </w:p>
         </w:tc>
@@ -6541,6 +8473,66 @@
           <w:szCs w:val="21"/>
         </w:rPr>
         <w:t xml:space="preserve"> "To prevent single points of failure in production, we built an adaptive worker abstraction. If Redis is configured, it utilizes BullMQ for distributed Redis queues; if Redis is absent or fails, the server transparently switches to an in-memory poller against MongoDB scheduled tasks, ensuring zero downtime and zero configuration headaches for clients."</w:t>
+      </w:r>
+    </w:p>
+    <w:p>
+      <w:pPr>
+        <w:pStyle w:val="ListParagraph"/>
+        <w:numPr>
+          <w:ilvl w:val="0"/>
+          <w:numId w:val="1"/>
+        </w:numPr>
+        <w:spacing w:after="60" w:before="60" w:line="260"/>
+      </w:pPr>
+      <w:r>
+        <w:rPr>
+          <w:rFonts w:ascii="Calibri" w:cs="Calibri" w:eastAsia="Calibri" w:hAnsi="Calibri"/>
+          <w:b/>
+          <w:bCs/>
+          <w:color w:val="0F172A"/>
+          <w:sz w:val="21"/>
+          <w:szCs w:val="21"/>
+        </w:rPr>
+        <w:t xml:space="preserve">Q5: Why did you choose interval polling over WebSockets for in-app notifications?</w:t>
+      </w:r>
+      <w:r>
+        <w:rPr>
+          <w:rFonts w:ascii="Calibri" w:cs="Calibri" w:eastAsia="Calibri" w:hAnsi="Calibri"/>
+          <w:color w:val="334155"/>
+          <w:sz w:val="21"/>
+          <w:szCs w:val="21"/>
+        </w:rPr>
+        <w:t xml:space="preserve"> "We evaluated WebSockets versus lightweight interval polling (30s) and chose polling for three architectural advantages: First, WebSockets maintain persistent stateful TCP sockets that require sticky sessions and Redis Pub/Sub adapters when horizontally scaling across serverless or containerized tiers (such as Render or AWS ECS). Second, notification checks are extremely lightweight, querying an indexed MongoDB count in sub-5ms. Third, polling is completely immune to socket drops caused by network switching, firewall timeouts, and laptop/mobile sleep modes."</w:t>
+      </w:r>
+    </w:p>
+    <w:p>
+      <w:pPr>
+        <w:pStyle w:val="ListParagraph"/>
+        <w:numPr>
+          <w:ilvl w:val="0"/>
+          <w:numId w:val="1"/>
+        </w:numPr>
+        <w:spacing w:after="60" w:before="60" w:line="260"/>
+      </w:pPr>
+      <w:r>
+        <w:rPr>
+          <w:rFonts w:ascii="Calibri" w:cs="Calibri" w:eastAsia="Calibri" w:hAnsi="Calibri"/>
+          <w:b/>
+          <w:bCs/>
+          <w:color w:val="0F172A"/>
+          <w:sz w:val="21"/>
+          <w:szCs w:val="21"/>
+        </w:rPr>
+        <w:t xml:space="preserve">Q6: How does Active Session Governance prevent token hijacking and handle remote revocation?</w:t>
+      </w:r>
+      <w:r>
+        <w:rPr>
+          <w:rFonts w:ascii="Calibri" w:cs="Calibri" w:eastAsia="Calibri" w:hAnsi="Calibri"/>
+          <w:color w:val="334155"/>
+          <w:sz w:val="21"/>
+          <w:szCs w:val="21"/>
+        </w:rPr>
+        <w:t xml:space="preserve"> "Every login creates a cryptographically hashed refresh token record in the Session collection alongside IP and User-Agent device fingerprints. When a user changes their password, revokes a specific device session, or triggers 'Revoke All Other Sessions', the corresponding session records are immediately invalidated in MongoDB. During token rotation, our auth service verifies the token against the active session table; any revoked token is immediately rejected with a 401 Unauthorized, eliminating session hijacking vulnerabilities."</w:t>
       </w:r>
     </w:p>
     <w:p>

</xml_diff>